<commit_message>
Harden private client CIDR installer parsing
Co-authored-by: jjgrout <jjgrout@users.noreply.github.com>
</commit_message>
<xml_diff>
--- a/docs/adf-testimonial-generator-implementation-guide.docx
+++ b/docs/adf-testimonial-generator-implementation-guide.docx
@@ -409,6 +409,190 @@
       </w:r>
       <w:r>
         <w:t xml:space="preserve">, enter that value when the installer asks for private client CIDRs.</w:t>
+      </w:r>
+    </w:p>
+    <w:p>
+      <w:pPr>
+        <w:spacing w:after="140"/>
+      </w:pPr>
+      <w:r>
+        <w:t xml:space="preserve">Do not type an unmatched bracketed value such as:</w:t>
+      </w:r>
+    </w:p>
+    <w:p>
+      <w:pPr>
+        <w:shd w:fill="F3F4F6" w:val="clear"/>
+        <w:spacing w:after="40" w:before="40"/>
+      </w:pPr>
+      <w:r>
+        <w:rPr>
+          <w:rFonts w:ascii="Courier New" w:cs="Courier New" w:eastAsia="Courier New" w:hAnsi="Courier New"/>
+          <w:sz w:val="19"/>
+          <w:szCs w:val="19"/>
+        </w:rPr>
+        <w:t xml:space="preserve">[10.50.0.0/22</w:t>
+      </w:r>
+    </w:p>
+    <w:p>
+      <w:pPr>
+        <w:spacing w:after="140"/>
+      </w:pPr>
+      <w:r>
+        <w:t xml:space="preserve">That is not valid CIDR notation. The value should be:</w:t>
+      </w:r>
+    </w:p>
+    <w:p>
+      <w:pPr>
+        <w:shd w:fill="F3F4F6" w:val="clear"/>
+        <w:spacing w:after="40" w:before="40"/>
+      </w:pPr>
+      <w:r>
+        <w:rPr>
+          <w:rFonts w:ascii="Courier New" w:cs="Courier New" w:eastAsia="Courier New" w:hAnsi="Courier New"/>
+          <w:sz w:val="19"/>
+          <w:szCs w:val="19"/>
+        </w:rPr>
+        <w:t xml:space="preserve">10.50.0.0/22</w:t>
+      </w:r>
+    </w:p>
+    <w:p>
+      <w:pPr>
+        <w:spacing w:after="140"/>
+      </w:pPr>
+      <w:r>
+        <w:t xml:space="preserve">If you have more than one range, separate them with commas:</w:t>
+      </w:r>
+    </w:p>
+    <w:p>
+      <w:pPr>
+        <w:shd w:fill="F3F4F6" w:val="clear"/>
+        <w:spacing w:after="40" w:before="40"/>
+      </w:pPr>
+      <w:r>
+        <w:rPr>
+          <w:rFonts w:ascii="Courier New" w:cs="Courier New" w:eastAsia="Courier New" w:hAnsi="Courier New"/>
+          <w:sz w:val="19"/>
+          <w:szCs w:val="19"/>
+        </w:rPr>
+        <w:t xml:space="preserve">10.50.0.0/22,10.60.0.0/22</w:t>
+      </w:r>
+    </w:p>
+    <w:p>
+      <w:pPr>
+        <w:spacing w:after="140"/>
+      </w:pPr>
+      <w:r>
+        <w:t xml:space="preserve">The installer now normalises common input forms and checks the CIDR before deployment. If the CIDR is malformed, it stops before CDK deploy and tells you which value is invalid.</w:t>
+      </w:r>
+    </w:p>
+    <w:p>
+      <w:pPr>
+        <w:spacing w:after="140"/>
+      </w:pPr>
+      <w:r>
+        <w:t xml:space="preserve">If you see a message like this after running a global </w:t>
+      </w:r>
+      <w:r>
+        <w:rPr>
+          <w:rFonts w:ascii="Courier New" w:cs="Courier New" w:eastAsia="Courier New" w:hAnsi="Courier New"/>
+          <w:shd w:fill="EEF2F7" w:val="clear"/>
+        </w:rPr>
+        <w:t xml:space="preserve">cdk</w:t>
+      </w:r>
+      <w:r>
+        <w:t xml:space="preserve"> command:</w:t>
+      </w:r>
+    </w:p>
+    <w:p>
+      <w:pPr>
+        <w:shd w:fill="F3F4F6" w:val="clear"/>
+        <w:spacing w:after="40" w:before="40"/>
+      </w:pPr>
+      <w:r>
+        <w:rPr>
+          <w:rFonts w:ascii="Courier New" w:cs="Courier New" w:eastAsia="Courier New" w:hAnsi="Courier New"/>
+          <w:sz w:val="19"/>
+          <w:szCs w:val="19"/>
+        </w:rPr>
+        <w:t xml:space="preserve">This CDK CLI is not compatible with the CDK library used by your application.</w:t>
+      </w:r>
+    </w:p>
+    <w:p>
+      <w:pPr>
+        <w:shd w:fill="F3F4F6" w:val="clear"/>
+        <w:spacing w:after="40" w:before="40"/>
+      </w:pPr>
+      <w:r>
+        <w:rPr>
+          <w:rFonts w:ascii="Courier New" w:cs="Courier New" w:eastAsia="Courier New" w:hAnsi="Courier New"/>
+          <w:sz w:val="19"/>
+          <w:szCs w:val="19"/>
+        </w:rPr>
+        <w:t xml:space="preserve">Cloud assembly schema version mismatch</w:t>
+      </w:r>
+    </w:p>
+    <w:p>
+      <w:pPr>
+        <w:spacing w:after="140"/>
+      </w:pPr>
+      <w:r>
+        <w:t xml:space="preserve">it means the globally installed CDK CLI is older than the CDK library used by this project. Use the project-local CDK CLI from inside the repository instead:</w:t>
+      </w:r>
+    </w:p>
+    <w:p>
+      <w:pPr>
+        <w:shd w:fill="F3F4F6" w:val="clear"/>
+        <w:spacing w:after="40" w:before="40"/>
+      </w:pPr>
+      <w:r>
+        <w:rPr>
+          <w:rFonts w:ascii="Courier New" w:cs="Courier New" w:eastAsia="Courier New" w:hAnsi="Courier New"/>
+          <w:sz w:val="19"/>
+          <w:szCs w:val="19"/>
+        </w:rPr>
+        <w:t xml:space="preserve">npm run cdk -- --version</w:t>
+      </w:r>
+    </w:p>
+    <w:p>
+      <w:pPr>
+        <w:shd w:fill="F3F4F6" w:val="clear"/>
+        <w:spacing w:after="40" w:before="40"/>
+      </w:pPr>
+      <w:r>
+        <w:rPr>
+          <w:rFonts w:ascii="Courier New" w:cs="Courier New" w:eastAsia="Courier New" w:hAnsi="Courier New"/>
+          <w:sz w:val="19"/>
+          <w:szCs w:val="19"/>
+        </w:rPr>
+        <w:t xml:space="preserve">npm run cdk -- flags --unstable=flags</w:t>
+      </w:r>
+    </w:p>
+    <w:p>
+      <w:pPr>
+        <w:spacing w:after="140"/>
+      </w:pPr>
+      <w:r>
+        <w:t xml:space="preserve">The guided installer already uses the project-local CDK CLI through </w:t>
+      </w:r>
+      <w:r>
+        <w:rPr>
+          <w:rFonts w:ascii="Courier New" w:cs="Courier New" w:eastAsia="Courier New" w:hAnsi="Courier New"/>
+          <w:shd w:fill="EEF2F7" w:val="clear"/>
+        </w:rPr>
+        <w:t xml:space="preserve">npx cdk</w:t>
+      </w:r>
+      <w:r>
+        <w:t xml:space="preserve">, so this mismatch normally only appears when you manually run the global </w:t>
+      </w:r>
+      <w:r>
+        <w:rPr>
+          <w:rFonts w:ascii="Courier New" w:cs="Courier New" w:eastAsia="Courier New" w:hAnsi="Courier New"/>
+          <w:shd w:fill="EEF2F7" w:val="clear"/>
+        </w:rPr>
+        <w:t xml:space="preserve">cdk</w:t>
+      </w:r>
+      <w:r>
+        <w:t xml:space="preserve"> command.</w:t>
       </w:r>
     </w:p>
     <w:p>

</xml_diff>